<commit_message>
docs: Update final report with Rashed track change and family names
</commit_message>
<xml_diff>
--- a/تقرير_متابعة_الغياب_والدرجات_المعتمد_نهائي_2026.docx
+++ b/تقرير_متابعة_الغياب_والدرجات_المعتمد_نهائي_2026.docx
@@ -417,7 +417,7 @@
                 <w:sz w:val="26"/>
                 <w:rtl w:val="1"/>
               </w:rPr>
-              <w:t>22 طالباً</w:t>
+              <w:t>21 طالباً</w:t>
             </w:r>
           </w:p>
         </w:tc>
@@ -3272,7 +3272,7 @@
                 <w:sz w:val="18"/>
                 <w:rtl w:val="1"/>
               </w:rPr>
-              <w:t>راشد عبد الكريم بشير</w:t>
+              <w:t>أمنية محمد عبد الرحمن</w:t>
             </w:r>
           </w:p>
         </w:tc>
@@ -3404,7 +3404,7 @@
         <w:tc>
           <w:tcPr>
             <w:tcW w:type="dxa" w:w="648"/>
-            <w:shd w:fill="ECFDF5"/>
+            <w:shd w:fill="FFFBEB"/>
             <w:tcMar>
               <w:top w:w="80" w:type="dxa"/>
               <w:bottom w:w="80" w:type="dxa"/>
@@ -3434,7 +3434,7 @@
         <w:tc>
           <w:tcPr>
             <w:tcW w:type="dxa" w:w="2664"/>
-            <w:shd w:fill="ECFDF5"/>
+            <w:shd w:fill="FFFBEB"/>
             <w:tcMar>
               <w:top w:w="80" w:type="dxa"/>
               <w:bottom w:w="80" w:type="dxa"/>
@@ -3457,14 +3457,14 @@
                 <w:sz w:val="18"/>
                 <w:rtl w:val="1"/>
               </w:rPr>
-              <w:t>أمنية محمد عبد الرحمن</w:t>
+              <w:t>أرين أشرف مجدى</w:t>
             </w:r>
           </w:p>
         </w:tc>
         <w:tc>
           <w:tcPr>
             <w:tcW w:type="dxa" w:w="1368"/>
-            <w:shd w:fill="ECFDF5"/>
+            <w:shd w:fill="FFFBEB"/>
             <w:tcMar>
               <w:top w:w="80" w:type="dxa"/>
               <w:bottom w:w="80" w:type="dxa"/>
@@ -3483,18 +3483,18 @@
               <w:rPr>
                 <w:rFonts w:ascii="Arial" w:hAnsi="Arial" w:cs="Arial"/>
                 <w:b/>
-                <w:color w:val="047857"/>
+                <w:color w:val="B45309"/>
                 <w:sz w:val="18"/>
                 <w:rtl w:val="1"/>
               </w:rPr>
-              <w:t>الصف 2</w:t>
+              <w:t>الصف 3</w:t>
             </w:r>
           </w:p>
         </w:tc>
         <w:tc>
           <w:tcPr>
             <w:tcW w:type="dxa" w:w="1080"/>
-            <w:shd w:fill="ECFDF5"/>
+            <w:shd w:fill="FFFBEB"/>
             <w:tcMar>
               <w:top w:w="80" w:type="dxa"/>
               <w:bottom w:w="80" w:type="dxa"/>
@@ -3517,14 +3517,14 @@
                 <w:sz w:val="18"/>
                 <w:rtl w:val="1"/>
               </w:rPr>
-              <w:t>لغات</w:t>
+              <w:t>عربي</w:t>
             </w:r>
           </w:p>
         </w:tc>
         <w:tc>
           <w:tcPr>
             <w:tcW w:type="dxa" w:w="2736"/>
-            <w:shd w:fill="ECFDF5"/>
+            <w:shd w:fill="FFFBEB"/>
             <w:tcMar>
               <w:top w:w="80" w:type="dxa"/>
               <w:bottom w:w="80" w:type="dxa"/>
@@ -3547,14 +3547,14 @@
                 <w:sz w:val="18"/>
                 <w:rtl w:val="1"/>
               </w:rPr>
-              <w:t>Connect Plus / English AL</w:t>
+              <w:t>التربية الدينية</w:t>
             </w:r>
           </w:p>
         </w:tc>
         <w:tc>
           <w:tcPr>
             <w:tcW w:type="dxa" w:w="1973"/>
-            <w:shd w:fill="ECFDF5"/>
+            <w:shd w:fill="FFFBEB"/>
             <w:tcMar>
               <w:top w:w="80" w:type="dxa"/>
               <w:bottom w:w="80" w:type="dxa"/>
@@ -3577,7 +3577,7 @@
                 <w:sz w:val="18"/>
                 <w:rtl w:val="1"/>
               </w:rPr>
-              <w:t>عقد اختبار تعويضي في ورقة (Connect Plus / English AL) فقط</w:t>
+              <w:t>عقد اختبار تعويضي في ورقة (التربية الدينية) فقط</w:t>
             </w:r>
           </w:p>
         </w:tc>
@@ -3642,7 +3642,7 @@
                 <w:sz w:val="18"/>
                 <w:rtl w:val="1"/>
               </w:rPr>
-              <w:t>أرين أشرف مجدى</w:t>
+              <w:t>زين محمد نبيل نوار</w:t>
             </w:r>
           </w:p>
         </w:tc>
@@ -3702,7 +3702,7 @@
                 <w:sz w:val="18"/>
                 <w:rtl w:val="1"/>
               </w:rPr>
-              <w:t>عربي</w:t>
+              <w:t>لغات</w:t>
             </w:r>
           </w:p>
         </w:tc>
@@ -3827,7 +3827,7 @@
                 <w:sz w:val="18"/>
                 <w:rtl w:val="1"/>
               </w:rPr>
-              <w:t>زين محمد نبيل نوار</w:t>
+              <w:t>رائد عبد الكريم بشير</w:t>
             </w:r>
           </w:p>
         </w:tc>
@@ -3917,7 +3917,7 @@
                 <w:sz w:val="18"/>
                 <w:rtl w:val="1"/>
               </w:rPr>
-              <w:t>التربية الدينية</w:t>
+              <w:t>Connect Plus / English AL</w:t>
             </w:r>
           </w:p>
         </w:tc>
@@ -3947,7 +3947,7 @@
                 <w:sz w:val="18"/>
                 <w:rtl w:val="1"/>
               </w:rPr>
-              <w:t>عقد اختبار تعويضي في ورقة (التربية الدينية) فقط</w:t>
+              <w:t>عقد اختبار تعويضي في ورقة (Connect Plus / English AL) فقط</w:t>
             </w:r>
           </w:p>
         </w:tc>
@@ -4012,7 +4012,7 @@
                 <w:sz w:val="18"/>
                 <w:rtl w:val="1"/>
               </w:rPr>
-              <w:t>رائد عبد الكريم بشير</w:t>
+              <w:t>ريمان جمال الحسين</w:t>
             </w:r>
           </w:p>
         </w:tc>
@@ -4197,7 +4197,7 @@
                 <w:sz w:val="18"/>
                 <w:rtl w:val="1"/>
               </w:rPr>
-              <w:t>ريمان جمال الحسين</w:t>
+              <w:t>مؤيد أحمد سيد</w:t>
             </w:r>
           </w:p>
         </w:tc>
@@ -4287,7 +4287,7 @@
                 <w:sz w:val="18"/>
                 <w:rtl w:val="1"/>
               </w:rPr>
-              <w:t>Connect Plus / English AL</w:t>
+              <w:t>اللغة العربية</w:t>
             </w:r>
           </w:p>
         </w:tc>
@@ -4317,7 +4317,7 @@
                 <w:sz w:val="18"/>
                 <w:rtl w:val="1"/>
               </w:rPr>
-              <w:t>عقد اختبار تعويضي في ورقة (Connect Plus / English AL) فقط</w:t>
+              <w:t>عقد اختبار تعويضي في ورقة (اللغة العربية) فقط</w:t>
             </w:r>
           </w:p>
         </w:tc>
@@ -4382,7 +4382,7 @@
                 <w:sz w:val="18"/>
                 <w:rtl w:val="1"/>
               </w:rPr>
-              <w:t>مؤيد أحمد سيد</w:t>
+              <w:t>ريتال محمد عسل</w:t>
             </w:r>
           </w:p>
         </w:tc>
@@ -4472,7 +4472,7 @@
                 <w:sz w:val="18"/>
                 <w:rtl w:val="1"/>
               </w:rPr>
-              <w:t>اللغة العربية</w:t>
+              <w:t>Connect Plus / English AL</w:t>
             </w:r>
           </w:p>
         </w:tc>
@@ -4502,7 +4502,7 @@
                 <w:sz w:val="18"/>
                 <w:rtl w:val="1"/>
               </w:rPr>
-              <w:t>عقد اختبار تعويضي في ورقة (اللغة العربية) فقط</w:t>
+              <w:t>عقد اختبار تعويضي في ورقة (Connect Plus / English AL) فقط</w:t>
             </w:r>
           </w:p>
         </w:tc>
@@ -4514,7 +4514,7 @@
         <w:tc>
           <w:tcPr>
             <w:tcW w:type="dxa" w:w="648"/>
-            <w:shd w:fill="FFFBEB"/>
+            <w:shd w:fill="EEF2FF"/>
             <w:tcMar>
               <w:top w:w="80" w:type="dxa"/>
               <w:bottom w:w="80" w:type="dxa"/>
@@ -4544,7 +4544,7 @@
         <w:tc>
           <w:tcPr>
             <w:tcW w:type="dxa" w:w="2664"/>
-            <w:shd w:fill="FFFBEB"/>
+            <w:shd w:fill="EEF2FF"/>
             <w:tcMar>
               <w:top w:w="80" w:type="dxa"/>
               <w:bottom w:w="80" w:type="dxa"/>
@@ -4567,14 +4567,14 @@
                 <w:sz w:val="18"/>
                 <w:rtl w:val="1"/>
               </w:rPr>
-              <w:t>ريتال محمد عسل</w:t>
+              <w:t>مها رضوان تسون</w:t>
             </w:r>
           </w:p>
         </w:tc>
         <w:tc>
           <w:tcPr>
             <w:tcW w:type="dxa" w:w="1368"/>
-            <w:shd w:fill="FFFBEB"/>
+            <w:shd w:fill="EEF2FF"/>
             <w:tcMar>
               <w:top w:w="80" w:type="dxa"/>
               <w:bottom w:w="80" w:type="dxa"/>
@@ -4593,18 +4593,18 @@
               <w:rPr>
                 <w:rFonts w:ascii="Arial" w:hAnsi="Arial" w:cs="Arial"/>
                 <w:b/>
-                <w:color w:val="B45309"/>
+                <w:color w:val="4338CA"/>
                 <w:sz w:val="18"/>
                 <w:rtl w:val="1"/>
               </w:rPr>
-              <w:t>الصف 3</w:t>
+              <w:t>الصف 4</w:t>
             </w:r>
           </w:p>
         </w:tc>
         <w:tc>
           <w:tcPr>
             <w:tcW w:type="dxa" w:w="1080"/>
-            <w:shd w:fill="FFFBEB"/>
+            <w:shd w:fill="EEF2FF"/>
             <w:tcMar>
               <w:top w:w="80" w:type="dxa"/>
               <w:bottom w:w="80" w:type="dxa"/>
@@ -4627,14 +4627,14 @@
                 <w:sz w:val="18"/>
                 <w:rtl w:val="1"/>
               </w:rPr>
-              <w:t>لغات</w:t>
+              <w:t>عربي</w:t>
             </w:r>
           </w:p>
         </w:tc>
         <w:tc>
           <w:tcPr>
             <w:tcW w:type="dxa" w:w="2736"/>
-            <w:shd w:fill="FFFBEB"/>
+            <w:shd w:fill="EEF2FF"/>
             <w:tcMar>
               <w:top w:w="80" w:type="dxa"/>
               <w:bottom w:w="80" w:type="dxa"/>
@@ -4657,14 +4657,14 @@
                 <w:sz w:val="18"/>
                 <w:rtl w:val="1"/>
               </w:rPr>
-              <w:t>Connect Plus / English AL</w:t>
+              <w:t>اللغة الإنجليزية OL</w:t>
             </w:r>
           </w:p>
         </w:tc>
         <w:tc>
           <w:tcPr>
             <w:tcW w:type="dxa" w:w="1973"/>
-            <w:shd w:fill="FFFBEB"/>
+            <w:shd w:fill="EEF2FF"/>
             <w:tcMar>
               <w:top w:w="80" w:type="dxa"/>
               <w:bottom w:w="80" w:type="dxa"/>
@@ -4687,7 +4687,7 @@
                 <w:sz w:val="18"/>
                 <w:rtl w:val="1"/>
               </w:rPr>
-              <w:t>عقد اختبار تعويضي في ورقة (Connect Plus / English AL) فقط</w:t>
+              <w:t>عقد اختبار تعويضي في ورقة (اللغة الإنجليزية OL) فقط</w:t>
             </w:r>
           </w:p>
         </w:tc>
@@ -4752,7 +4752,7 @@
                 <w:sz w:val="18"/>
                 <w:rtl w:val="1"/>
               </w:rPr>
-              <w:t>مها رضوان تسون</w:t>
+              <w:t>كارما أحمد عطية</w:t>
             </w:r>
           </w:p>
         </w:tc>
@@ -4842,7 +4842,7 @@
                 <w:sz w:val="18"/>
                 <w:rtl w:val="1"/>
               </w:rPr>
-              <w:t>اللغة الإنجليزية OL</w:t>
+              <w:t>الرياضيات / Math</w:t>
             </w:r>
           </w:p>
         </w:tc>
@@ -4872,7 +4872,7 @@
                 <w:sz w:val="18"/>
                 <w:rtl w:val="1"/>
               </w:rPr>
-              <w:t>عقد اختبار تعويضي في ورقة (اللغة الإنجليزية OL) فقط</w:t>
+              <w:t>عقد اختبار تعويضي في ورقة (الرياضيات / Math) فقط</w:t>
             </w:r>
           </w:p>
         </w:tc>
@@ -4937,7 +4937,7 @@
                 <w:sz w:val="18"/>
                 <w:rtl w:val="1"/>
               </w:rPr>
-              <w:t>كارما أحمد عطية</w:t>
+              <w:t>عبد الله مروان الشيخ</w:t>
             </w:r>
           </w:p>
         </w:tc>
@@ -5027,7 +5027,7 @@
                 <w:sz w:val="18"/>
                 <w:rtl w:val="1"/>
               </w:rPr>
-              <w:t>الرياضيات / Math</w:t>
+              <w:t>اللغة العربية</w:t>
             </w:r>
           </w:p>
         </w:tc>
@@ -5057,7 +5057,7 @@
                 <w:sz w:val="18"/>
                 <w:rtl w:val="1"/>
               </w:rPr>
-              <w:t>عقد اختبار تعويضي في ورقة (الرياضيات / Math) فقط</w:t>
+              <w:t>عقد اختبار تعويضي في ورقة (اللغة العربية) فقط</w:t>
             </w:r>
           </w:p>
         </w:tc>
@@ -5122,7 +5122,7 @@
                 <w:sz w:val="18"/>
                 <w:rtl w:val="1"/>
               </w:rPr>
-              <w:t>عبد الله مروان الشيخ</w:t>
+              <w:t>جنة عمرو أبو المكارم</w:t>
             </w:r>
           </w:p>
         </w:tc>
@@ -5182,7 +5182,7 @@
                 <w:sz w:val="18"/>
                 <w:rtl w:val="1"/>
               </w:rPr>
-              <w:t>عربي</w:t>
+              <w:t>لغات</w:t>
             </w:r>
           </w:p>
         </w:tc>
@@ -5307,7 +5307,7 @@
                 <w:sz w:val="18"/>
                 <w:rtl w:val="1"/>
               </w:rPr>
-              <w:t>جنة عمرو أبو المكارم</w:t>
+              <w:t>يامن محمد رفعت</w:t>
             </w:r>
           </w:p>
         </w:tc>
@@ -5397,7 +5397,7 @@
                 <w:sz w:val="18"/>
                 <w:rtl w:val="1"/>
               </w:rPr>
-              <w:t>اللغة العربية</w:t>
+              <w:t>التربية الدينية</w:t>
             </w:r>
           </w:p>
         </w:tc>
@@ -5427,7 +5427,7 @@
                 <w:sz w:val="18"/>
                 <w:rtl w:val="1"/>
               </w:rPr>
-              <w:t>عقد اختبار تعويضي في ورقة (اللغة العربية) فقط</w:t>
+              <w:t>عقد اختبار تعويضي في ورقة (التربية الدينية) فقط</w:t>
             </w:r>
           </w:p>
         </w:tc>
@@ -5492,7 +5492,7 @@
                 <w:sz w:val="18"/>
                 <w:rtl w:val="1"/>
               </w:rPr>
-              <w:t>يامن محمد رفعت</w:t>
+              <w:t>روفان عمر عبد المقصود</w:t>
             </w:r>
           </w:p>
         </w:tc>
@@ -5677,7 +5677,7 @@
                 <w:sz w:val="18"/>
                 <w:rtl w:val="1"/>
               </w:rPr>
-              <w:t>روفان عمر عبد المقصود</w:t>
+              <w:t>فريدة أحمد ضاحي</w:t>
             </w:r>
           </w:p>
         </w:tc>
@@ -5767,7 +5767,7 @@
                 <w:sz w:val="18"/>
                 <w:rtl w:val="1"/>
               </w:rPr>
-              <w:t>التربية الدينية</w:t>
+              <w:t>الدراسات الاجتماعية</w:t>
             </w:r>
           </w:p>
         </w:tc>
@@ -5797,7 +5797,7 @@
                 <w:sz w:val="18"/>
                 <w:rtl w:val="1"/>
               </w:rPr>
-              <w:t>عقد اختبار تعويضي في ورقة (التربية الدينية) فقط</w:t>
+              <w:t>عقد اختبار تعويضي في ورقة (الدراسات الاجتماعية) فقط</w:t>
             </w:r>
           </w:p>
         </w:tc>
@@ -5809,7 +5809,7 @@
         <w:tc>
           <w:tcPr>
             <w:tcW w:type="dxa" w:w="648"/>
-            <w:shd w:fill="EEF2FF"/>
+            <w:shd w:fill="EFF6FF"/>
             <w:tcMar>
               <w:top w:w="80" w:type="dxa"/>
               <w:bottom w:w="80" w:type="dxa"/>
@@ -5839,7 +5839,7 @@
         <w:tc>
           <w:tcPr>
             <w:tcW w:type="dxa" w:w="2664"/>
-            <w:shd w:fill="EEF2FF"/>
+            <w:shd w:fill="EFF6FF"/>
             <w:tcMar>
               <w:top w:w="80" w:type="dxa"/>
               <w:bottom w:w="80" w:type="dxa"/>
@@ -5862,14 +5862,14 @@
                 <w:sz w:val="18"/>
                 <w:rtl w:val="1"/>
               </w:rPr>
-              <w:t>فريدة أحمد ضاحي</w:t>
+              <w:t>سعد محمود منصور</w:t>
             </w:r>
           </w:p>
         </w:tc>
         <w:tc>
           <w:tcPr>
             <w:tcW w:type="dxa" w:w="1368"/>
-            <w:shd w:fill="EEF2FF"/>
+            <w:shd w:fill="EFF6FF"/>
             <w:tcMar>
               <w:top w:w="80" w:type="dxa"/>
               <w:bottom w:w="80" w:type="dxa"/>
@@ -5888,18 +5888,18 @@
               <w:rPr>
                 <w:rFonts w:ascii="Arial" w:hAnsi="Arial" w:cs="Arial"/>
                 <w:b/>
-                <w:color w:val="4338CA"/>
+                <w:color w:val="1D4ED8"/>
                 <w:sz w:val="18"/>
                 <w:rtl w:val="1"/>
               </w:rPr>
-              <w:t>الصف 4</w:t>
+              <w:t>الصف 8</w:t>
             </w:r>
           </w:p>
         </w:tc>
         <w:tc>
           <w:tcPr>
             <w:tcW w:type="dxa" w:w="1080"/>
-            <w:shd w:fill="EEF2FF"/>
+            <w:shd w:fill="EFF6FF"/>
             <w:tcMar>
               <w:top w:w="80" w:type="dxa"/>
               <w:bottom w:w="80" w:type="dxa"/>
@@ -5922,14 +5922,14 @@
                 <w:sz w:val="18"/>
                 <w:rtl w:val="1"/>
               </w:rPr>
-              <w:t>لغات</w:t>
+              <w:t>عربي</w:t>
             </w:r>
           </w:p>
         </w:tc>
         <w:tc>
           <w:tcPr>
             <w:tcW w:type="dxa" w:w="2736"/>
-            <w:shd w:fill="EEF2FF"/>
+            <w:shd w:fill="EFF6FF"/>
             <w:tcMar>
               <w:top w:w="80" w:type="dxa"/>
               <w:bottom w:w="80" w:type="dxa"/>
@@ -5959,7 +5959,7 @@
         <w:tc>
           <w:tcPr>
             <w:tcW w:type="dxa" w:w="1973"/>
-            <w:shd w:fill="EEF2FF"/>
+            <w:shd w:fill="EFF6FF"/>
             <w:tcMar>
               <w:top w:w="80" w:type="dxa"/>
               <w:bottom w:w="80" w:type="dxa"/>
@@ -6018,191 +6018,6 @@
                 <w:rtl w:val="1"/>
               </w:rPr>
               <w:t>21</w:t>
-            </w:r>
-          </w:p>
-        </w:tc>
-        <w:tc>
-          <w:tcPr>
-            <w:tcW w:type="dxa" w:w="2664"/>
-            <w:shd w:fill="EFF6FF"/>
-            <w:tcMar>
-              <w:top w:w="80" w:type="dxa"/>
-              <w:bottom w:w="80" w:type="dxa"/>
-              <w:left w:w="150" w:type="dxa"/>
-              <w:right w:w="150" w:type="dxa"/>
-            </w:tcMar>
-            <w:vAlign w:val="center"/>
-          </w:tcPr>
-          <w:p>
-            <w:pPr>
-              <w:bidi w:val="1"/>
-              <w:spacing w:before="0" w:after="60" w:line="276" w:lineRule="auto"/>
-              <w:jc w:val="right"/>
-            </w:pPr>
-            <w:r>
-              <w:rPr>
-                <w:rFonts w:ascii="Arial" w:hAnsi="Arial" w:cs="Arial"/>
-                <w:b/>
-                <w:color w:val="0F172A"/>
-                <w:sz w:val="18"/>
-                <w:rtl w:val="1"/>
-              </w:rPr>
-              <w:t>سعد محمود منصور</w:t>
-            </w:r>
-          </w:p>
-        </w:tc>
-        <w:tc>
-          <w:tcPr>
-            <w:tcW w:type="dxa" w:w="1368"/>
-            <w:shd w:fill="EFF6FF"/>
-            <w:tcMar>
-              <w:top w:w="80" w:type="dxa"/>
-              <w:bottom w:w="80" w:type="dxa"/>
-              <w:left w:w="150" w:type="dxa"/>
-              <w:right w:w="150" w:type="dxa"/>
-            </w:tcMar>
-            <w:vAlign w:val="center"/>
-          </w:tcPr>
-          <w:p>
-            <w:pPr>
-              <w:bidi w:val="1"/>
-              <w:spacing w:before="0" w:after="60" w:line="276" w:lineRule="auto"/>
-              <w:jc w:val="center"/>
-            </w:pPr>
-            <w:r>
-              <w:rPr>
-                <w:rFonts w:ascii="Arial" w:hAnsi="Arial" w:cs="Arial"/>
-                <w:b/>
-                <w:color w:val="1D4ED8"/>
-                <w:sz w:val="18"/>
-                <w:rtl w:val="1"/>
-              </w:rPr>
-              <w:t>الصف 8</w:t>
-            </w:r>
-          </w:p>
-        </w:tc>
-        <w:tc>
-          <w:tcPr>
-            <w:tcW w:type="dxa" w:w="1080"/>
-            <w:shd w:fill="EFF6FF"/>
-            <w:tcMar>
-              <w:top w:w="80" w:type="dxa"/>
-              <w:bottom w:w="80" w:type="dxa"/>
-              <w:left w:w="150" w:type="dxa"/>
-              <w:right w:w="150" w:type="dxa"/>
-            </w:tcMar>
-            <w:vAlign w:val="center"/>
-          </w:tcPr>
-          <w:p>
-            <w:pPr>
-              <w:bidi w:val="1"/>
-              <w:spacing w:before="0" w:after="60" w:line="276" w:lineRule="auto"/>
-              <w:jc w:val="center"/>
-            </w:pPr>
-            <w:r>
-              <w:rPr>
-                <w:rFonts w:ascii="Arial" w:hAnsi="Arial" w:cs="Arial"/>
-                <w:b/>
-                <w:color w:val="0F172A"/>
-                <w:sz w:val="18"/>
-                <w:rtl w:val="1"/>
-              </w:rPr>
-              <w:t>عربي</w:t>
-            </w:r>
-          </w:p>
-        </w:tc>
-        <w:tc>
-          <w:tcPr>
-            <w:tcW w:type="dxa" w:w="2736"/>
-            <w:shd w:fill="EFF6FF"/>
-            <w:tcMar>
-              <w:top w:w="80" w:type="dxa"/>
-              <w:bottom w:w="80" w:type="dxa"/>
-              <w:left w:w="150" w:type="dxa"/>
-              <w:right w:w="150" w:type="dxa"/>
-            </w:tcMar>
-            <w:vAlign w:val="center"/>
-          </w:tcPr>
-          <w:p>
-            <w:pPr>
-              <w:bidi w:val="1"/>
-              <w:spacing w:before="0" w:after="60" w:line="276" w:lineRule="auto"/>
-              <w:jc w:val="right"/>
-            </w:pPr>
-            <w:r>
-              <w:rPr>
-                <w:rFonts w:ascii="Arial" w:hAnsi="Arial" w:cs="Arial"/>
-                <w:b/>
-                <w:color w:val="B91C1C"/>
-                <w:sz w:val="18"/>
-                <w:rtl w:val="1"/>
-              </w:rPr>
-              <w:t>الدراسات الاجتماعية</w:t>
-            </w:r>
-          </w:p>
-        </w:tc>
-        <w:tc>
-          <w:tcPr>
-            <w:tcW w:type="dxa" w:w="1973"/>
-            <w:shd w:fill="EFF6FF"/>
-            <w:tcMar>
-              <w:top w:w="80" w:type="dxa"/>
-              <w:bottom w:w="80" w:type="dxa"/>
-              <w:left w:w="150" w:type="dxa"/>
-              <w:right w:w="150" w:type="dxa"/>
-            </w:tcMar>
-            <w:vAlign w:val="center"/>
-          </w:tcPr>
-          <w:p>
-            <w:pPr>
-              <w:bidi w:val="1"/>
-              <w:spacing w:before="0" w:after="60" w:line="276" w:lineRule="auto"/>
-              <w:jc w:val="right"/>
-            </w:pPr>
-            <w:r>
-              <w:rPr>
-                <w:rFonts w:ascii="Arial" w:hAnsi="Arial" w:cs="Arial"/>
-                <w:b/>
-                <w:color w:val="0F172A"/>
-                <w:sz w:val="18"/>
-                <w:rtl w:val="1"/>
-              </w:rPr>
-              <w:t>عقد اختبار تعويضي في ورقة (الدراسات الاجتماعية) فقط</w:t>
-            </w:r>
-          </w:p>
-        </w:tc>
-      </w:tr>
-      <w:tr>
-        <w:trPr>
-          <w:cantSplit/>
-        </w:trPr>
-        <w:tc>
-          <w:tcPr>
-            <w:tcW w:type="dxa" w:w="648"/>
-            <w:shd w:fill="EFF6FF"/>
-            <w:tcMar>
-              <w:top w:w="80" w:type="dxa"/>
-              <w:bottom w:w="80" w:type="dxa"/>
-              <w:left w:w="150" w:type="dxa"/>
-              <w:right w:w="150" w:type="dxa"/>
-            </w:tcMar>
-            <w:vAlign w:val="center"/>
-          </w:tcPr>
-          <w:p>
-            <w:pPr>
-              <w:bidi w:val="1"/>
-              <w:spacing w:before="0" w:after="60" w:line="276" w:lineRule="auto"/>
-              <w:jc w:val="center"/>
-            </w:pPr>
-            <w:r>
-              <w:rPr>
-                <w:rFonts w:ascii="Arial" w:hAnsi="Arial" w:cs="Arial"/>
-                <w:b/>
-                <w:color w:val="0F172A"/>
-                <w:sz w:val="18"/>
-                <w:rtl w:val="1"/>
-              </w:rPr>
-              <w:t>22</w:t>
             </w:r>
           </w:p>
         </w:tc>

</xml_diff>